<commit_message>
Tambah notula rapat 29 Agustus dan 7 September 2026, perbarui 25 September 2026
</commit_message>
<xml_diff>
--- a/2026/15. 25 September 2026 - Rapat Kesantrian/Hasil Rapat.docx
+++ b/2026/15. 25 September 2026 - Rapat Kesantrian/Hasil Rapat.docx
@@ -167,178 +167,178 @@
           <w:szCs w:val="72"/>
           <w:lang w:val="en-US"/>
         </w:rPr>
-        <w:t>Santri belum inisiatif merapikan wadah kudapan kajian Selasa malam</w:t>
-      </w:r>
-    </w:p>
-    <w:p>
-      <w:pPr>
-        <w:numPr>
-          <w:ilvl w:val="0"/>
-          <w:numId w:val="1"/>
-        </w:numPr>
-        <w:ind w:left="425" w:leftChars="0" w:hanging="425" w:firstLineChars="0"/>
-        <w:rPr>
-          <w:rFonts w:hint="default"/>
-          <w:sz w:val="72"/>
-          <w:szCs w:val="72"/>
-          <w:lang w:val="en-US"/>
-        </w:rPr>
-      </w:pPr>
-      <w:r>
-        <w:rPr>
-          <w:rFonts w:hint="default"/>
-          <w:sz w:val="72"/>
-          <w:szCs w:val="72"/>
-          <w:lang w:val="en-US"/>
-        </w:rPr>
-        <w:t>Otomatis tandon belum dipasang</w:t>
-      </w:r>
-    </w:p>
-    <w:p>
-      <w:pPr>
-        <w:numPr>
-          <w:ilvl w:val="0"/>
-          <w:numId w:val="1"/>
-        </w:numPr>
-        <w:ind w:left="425" w:leftChars="0" w:hanging="425" w:firstLineChars="0"/>
-        <w:rPr>
-          <w:rFonts w:hint="default"/>
-          <w:sz w:val="72"/>
-          <w:szCs w:val="72"/>
-          <w:lang w:val="en-US"/>
-        </w:rPr>
-      </w:pPr>
-      <w:r>
-        <w:rPr>
-          <w:rFonts w:hint="default"/>
-          <w:sz w:val="72"/>
-          <w:szCs w:val="72"/>
-          <w:lang w:val="en-US"/>
-        </w:rPr>
-        <w:t>Yang putri mulai berkelompok-kelompok ketika ke mana-mana. Sudah sampai tukar guling dan tidur satu selimut. Dan suka mojok berdua</w:t>
-      </w:r>
-    </w:p>
-    <w:p>
-      <w:pPr>
-        <w:numPr>
-          <w:ilvl w:val="0"/>
-          <w:numId w:val="1"/>
-        </w:numPr>
-        <w:ind w:left="425" w:leftChars="0" w:hanging="425" w:firstLineChars="0"/>
-        <w:rPr>
-          <w:rFonts w:hint="default"/>
-          <w:sz w:val="72"/>
-          <w:szCs w:val="72"/>
-          <w:lang w:val="en-US"/>
-        </w:rPr>
-      </w:pPr>
-      <w:r>
-        <w:rPr>
-          <w:rFonts w:hint="default"/>
-          <w:sz w:val="72"/>
-          <w:szCs w:val="72"/>
-          <w:lang w:val="en-US"/>
-        </w:rPr>
-        <w:t>Penyuluhan Bu Tinu pastikan sama Ustadz Iman, lalu buat suratnya</w:t>
-      </w:r>
-    </w:p>
-    <w:p>
-      <w:pPr>
-        <w:numPr>
-          <w:ilvl w:val="0"/>
-          <w:numId w:val="1"/>
-        </w:numPr>
-        <w:ind w:left="425" w:leftChars="0" w:hanging="425" w:firstLineChars="0"/>
-        <w:rPr>
-          <w:rFonts w:hint="default"/>
-          <w:sz w:val="72"/>
-          <w:szCs w:val="72"/>
-          <w:lang w:val="en-US"/>
-        </w:rPr>
-      </w:pPr>
-      <w:r>
-        <w:rPr>
-          <w:rFonts w:hint="default"/>
-          <w:sz w:val="72"/>
-          <w:szCs w:val="72"/>
-          <w:lang w:val="en-US"/>
-        </w:rPr>
-        <w:t>Ahad ini bersih-bersih lahan</w:t>
-      </w:r>
-    </w:p>
-    <w:p>
-      <w:pPr>
-        <w:numPr>
-          <w:ilvl w:val="0"/>
-          <w:numId w:val="1"/>
-        </w:numPr>
-        <w:ind w:left="425" w:leftChars="0" w:hanging="425" w:firstLineChars="0"/>
-        <w:rPr>
-          <w:rFonts w:hint="default"/>
-          <w:sz w:val="72"/>
-          <w:szCs w:val="72"/>
-          <w:lang w:val="en-US"/>
-        </w:rPr>
-      </w:pPr>
-      <w:r>
-        <w:rPr>
-          <w:rFonts w:hint="default"/>
-          <w:sz w:val="72"/>
-          <w:szCs w:val="72"/>
-          <w:lang w:val="en-US"/>
-        </w:rPr>
-        <w:t>Senam setiap Ahad pertama</w:t>
-      </w:r>
-    </w:p>
-    <w:p>
-      <w:pPr>
-        <w:numPr>
-          <w:ilvl w:val="0"/>
-          <w:numId w:val="1"/>
-        </w:numPr>
-        <w:ind w:left="425" w:leftChars="0" w:hanging="425" w:firstLineChars="0"/>
-        <w:rPr>
-          <w:rFonts w:hint="default"/>
-          <w:sz w:val="72"/>
-          <w:szCs w:val="72"/>
-          <w:lang w:val="en-US"/>
-        </w:rPr>
-      </w:pPr>
-      <w:r>
-        <w:rPr>
-          <w:rFonts w:hint="default"/>
-          <w:sz w:val="72"/>
-          <w:szCs w:val="72"/>
-          <w:lang w:val="en-US"/>
-        </w:rPr>
-        <w:t>MBS di masjid</w:t>
-      </w:r>
-    </w:p>
-    <w:p>
-      <w:pPr>
-        <w:numPr>
-          <w:ilvl w:val="0"/>
-          <w:numId w:val="1"/>
-        </w:numPr>
-        <w:ind w:left="425" w:leftChars="0" w:hanging="425" w:firstLineChars="0"/>
-        <w:rPr>
-          <w:rFonts w:hint="default"/>
-          <w:sz w:val="72"/>
-          <w:szCs w:val="72"/>
-          <w:lang w:val="en-US"/>
-        </w:rPr>
-      </w:pPr>
-      <w:r>
-        <w:rPr>
-          <w:rFonts w:hint="default"/>
-          <w:sz w:val="72"/>
-          <w:szCs w:val="72"/>
-          <w:lang w:val="en-US"/>
-        </w:rPr>
-        <w:t>Genset akan dicek Pakde Rimba</w:t>
+        <w:t>Santri belum inisiatif merapikan wadah kudapan kajian Selasa malam (Ketua : Rizki)</w:t>
       </w:r>
       <w:bookmarkStart w:id="0" w:name="_GoBack"/>
       <w:bookmarkEnd w:id="0"/>
+    </w:p>
+    <w:p>
+      <w:pPr>
+        <w:numPr>
+          <w:ilvl w:val="0"/>
+          <w:numId w:val="1"/>
+        </w:numPr>
+        <w:ind w:left="425" w:leftChars="0" w:hanging="425" w:firstLineChars="0"/>
+        <w:rPr>
+          <w:rFonts w:hint="default"/>
+          <w:sz w:val="72"/>
+          <w:szCs w:val="72"/>
+          <w:lang w:val="en-US"/>
+        </w:rPr>
+      </w:pPr>
+      <w:r>
+        <w:rPr>
+          <w:rFonts w:hint="default"/>
+          <w:sz w:val="72"/>
+          <w:szCs w:val="72"/>
+          <w:lang w:val="en-US"/>
+        </w:rPr>
+        <w:t>Otomatis tandon belum dipasang</w:t>
+      </w:r>
+    </w:p>
+    <w:p>
+      <w:pPr>
+        <w:numPr>
+          <w:ilvl w:val="0"/>
+          <w:numId w:val="1"/>
+        </w:numPr>
+        <w:ind w:left="425" w:leftChars="0" w:hanging="425" w:firstLineChars="0"/>
+        <w:rPr>
+          <w:rFonts w:hint="default"/>
+          <w:sz w:val="72"/>
+          <w:szCs w:val="72"/>
+          <w:lang w:val="en-US"/>
+        </w:rPr>
+      </w:pPr>
+      <w:r>
+        <w:rPr>
+          <w:rFonts w:hint="default"/>
+          <w:sz w:val="72"/>
+          <w:szCs w:val="72"/>
+          <w:lang w:val="en-US"/>
+        </w:rPr>
+        <w:t>Yang putri mulai berkelompok-kelompok ketika ke mana-mana. Sudah sampai tukar guling dan tidur satu selimut. Dan suka mojok berdua</w:t>
+      </w:r>
+    </w:p>
+    <w:p>
+      <w:pPr>
+        <w:numPr>
+          <w:ilvl w:val="0"/>
+          <w:numId w:val="1"/>
+        </w:numPr>
+        <w:ind w:left="425" w:leftChars="0" w:hanging="425" w:firstLineChars="0"/>
+        <w:rPr>
+          <w:rFonts w:hint="default"/>
+          <w:sz w:val="72"/>
+          <w:szCs w:val="72"/>
+          <w:lang w:val="en-US"/>
+        </w:rPr>
+      </w:pPr>
+      <w:r>
+        <w:rPr>
+          <w:rFonts w:hint="default"/>
+          <w:sz w:val="72"/>
+          <w:szCs w:val="72"/>
+          <w:lang w:val="en-US"/>
+        </w:rPr>
+        <w:t>Penyuluhan Bu Tinu pastikan sama Ustadz Iman, lalu buat suratnya</w:t>
+      </w:r>
+    </w:p>
+    <w:p>
+      <w:pPr>
+        <w:numPr>
+          <w:ilvl w:val="0"/>
+          <w:numId w:val="1"/>
+        </w:numPr>
+        <w:ind w:left="425" w:leftChars="0" w:hanging="425" w:firstLineChars="0"/>
+        <w:rPr>
+          <w:rFonts w:hint="default"/>
+          <w:sz w:val="72"/>
+          <w:szCs w:val="72"/>
+          <w:lang w:val="en-US"/>
+        </w:rPr>
+      </w:pPr>
+      <w:r>
+        <w:rPr>
+          <w:rFonts w:hint="default"/>
+          <w:sz w:val="72"/>
+          <w:szCs w:val="72"/>
+          <w:lang w:val="en-US"/>
+        </w:rPr>
+        <w:t>Ahad ini bersih-bersih lahan</w:t>
+      </w:r>
+    </w:p>
+    <w:p>
+      <w:pPr>
+        <w:numPr>
+          <w:ilvl w:val="0"/>
+          <w:numId w:val="1"/>
+        </w:numPr>
+        <w:ind w:left="425" w:leftChars="0" w:hanging="425" w:firstLineChars="0"/>
+        <w:rPr>
+          <w:rFonts w:hint="default"/>
+          <w:sz w:val="72"/>
+          <w:szCs w:val="72"/>
+          <w:lang w:val="en-US"/>
+        </w:rPr>
+      </w:pPr>
+      <w:r>
+        <w:rPr>
+          <w:rFonts w:hint="default"/>
+          <w:sz w:val="72"/>
+          <w:szCs w:val="72"/>
+          <w:lang w:val="en-US"/>
+        </w:rPr>
+        <w:t>Senam setiap Ahad pertama</w:t>
+      </w:r>
+    </w:p>
+    <w:p>
+      <w:pPr>
+        <w:numPr>
+          <w:ilvl w:val="0"/>
+          <w:numId w:val="1"/>
+        </w:numPr>
+        <w:ind w:left="425" w:leftChars="0" w:hanging="425" w:firstLineChars="0"/>
+        <w:rPr>
+          <w:rFonts w:hint="default"/>
+          <w:sz w:val="72"/>
+          <w:szCs w:val="72"/>
+          <w:lang w:val="en-US"/>
+        </w:rPr>
+      </w:pPr>
+      <w:r>
+        <w:rPr>
+          <w:rFonts w:hint="default"/>
+          <w:sz w:val="72"/>
+          <w:szCs w:val="72"/>
+          <w:lang w:val="en-US"/>
+        </w:rPr>
+        <w:t>MBS di masjid</w:t>
+      </w:r>
+    </w:p>
+    <w:p>
+      <w:pPr>
+        <w:numPr>
+          <w:ilvl w:val="0"/>
+          <w:numId w:val="1"/>
+        </w:numPr>
+        <w:ind w:left="425" w:leftChars="0" w:hanging="425" w:firstLineChars="0"/>
+        <w:rPr>
+          <w:rFonts w:hint="default"/>
+          <w:sz w:val="72"/>
+          <w:szCs w:val="72"/>
+          <w:lang w:val="en-US"/>
+        </w:rPr>
+      </w:pPr>
+      <w:r>
+        <w:rPr>
+          <w:rFonts w:hint="default"/>
+          <w:sz w:val="72"/>
+          <w:szCs w:val="72"/>
+          <w:lang w:val="en-US"/>
+        </w:rPr>
+        <w:t>Genset akan dicek Pakde Rimba</w:t>
+      </w:r>
     </w:p>
     <w:sectPr>
       <w:pgSz w:w="11906" w:h="16838"/>

</xml_diff>